<commit_message>
Sync full workspace state
</commit_message>
<xml_diff>
--- a/bao_cao_cuoi_ky.docx
+++ b/bao_cao_cuoi_ky.docx
@@ -5258,7 +5258,7 @@
         <w:ind w:left="425"/>
       </w:pPr>
       <w:r>
-        <w:t>- Huấn luyện hai mô hình trọng tâm đúng định hướng đề tài là Naive Bayes và Linear SVM; đồng thời benchmark thêm Logistic Regression và Random Forest để đối chứng.</w:t>
+        <w:t>- Huấn luyện và so sánh nhiều mô hình phân loại; trong đó Linear SVM là mô hình chính dùng để demo, Naive Bayes là mô hình đối chứng trọng tâm theo định hướng đề tài, còn Logistic Regression và Random Forest được dùng để benchmark thêm.</w:t>
       </w:r>
     </w:p>
     <w:p>
@@ -6031,27 +6031,26 @@
       </w:r>
     </w:p>
     <w:p>
-      <w:r>
-        <w:rPr>
-          <w:noProof/>
-        </w:rPr>
+      <w:pPr>
+        <w:jc w:val="center"/>
+      </w:pPr>
+      <w:r>
         <w:drawing>
-          <wp:inline distT="0" distB="0" distL="0" distR="0" wp14:anchorId="46F3339F" wp14:editId="7B104289">
-            <wp:extent cx="6217920" cy="1513319"/>
-            <wp:effectExtent l="0" t="0" r="0" b="0"/>
-            <wp:docPr id="1" name="Picture 1"/>
+          <wp:inline xmlns:a="http://schemas.openxmlformats.org/drawingml/2006/main" xmlns:pic="http://schemas.openxmlformats.org/drawingml/2006/picture">
+            <wp:extent cx="5806440" cy="1783407"/>
+            <wp:docPr id="2016737415" name="Picture 2016737415"/>
             <wp:cNvGraphicFramePr>
-              <a:graphicFrameLocks xmlns:a="http://schemas.openxmlformats.org/drawingml/2006/main" noChangeAspect="1"/>
+              <a:graphicFrameLocks noChangeAspect="1"/>
             </wp:cNvGraphicFramePr>
-            <a:graphic xmlns:a="http://schemas.openxmlformats.org/drawingml/2006/main">
+            <a:graphic>
               <a:graphicData uri="http://schemas.openxmlformats.org/drawingml/2006/picture">
-                <pic:pic xmlns:pic="http://schemas.openxmlformats.org/drawingml/2006/picture">
+                <pic:pic>
                   <pic:nvPicPr>
-                    <pic:cNvPr id="0" name="image.png"/>
+                    <pic:cNvPr id="0" name="pipeline_email_spam_system_report.png"/>
                     <pic:cNvPicPr/>
                   </pic:nvPicPr>
                   <pic:blipFill>
-                    <a:blip r:embed="rId10"/>
+                    <a:blip r:embed="rId24"/>
                     <a:stretch>
                       <a:fillRect/>
                     </a:stretch>
@@ -6059,11 +6058,9 @@
                   <pic:spPr>
                     <a:xfrm>
                       <a:off x="0" y="0"/>
-                      <a:ext cx="6217920" cy="1513319"/>
+                      <a:ext cx="5806440" cy="1783407"/>
                     </a:xfrm>
-                    <a:prstGeom prst="rect">
-                      <a:avLst/>
-                    </a:prstGeom>
+                    <a:prstGeom prst="rect"/>
                   </pic:spPr>
                 </pic:pic>
               </a:graphicData>
@@ -6076,6 +6073,7 @@
       <w:pPr>
         <w:pStyle w:val="Caption"/>
         <w:spacing w:before="80"/>
+        <w:jc w:val="center"/>
       </w:pPr>
       <w:bookmarkStart w:id="17" w:name="_Toc225690395"/>
       <w:r>
@@ -6125,6 +6123,12 @@
       <w:bookmarkEnd w:id="19"/>
     </w:p>
     <w:p>
+      <w:pPr/>
+      <w:r>
+        <w:t>Lưu ý khi đọc sơ đồ pipeline: saved pipeline của app gồm hai thành phần là TF-IDF để biểu diễn đặc trưng và Linear SVM để phân loại. Vì vậy, mô hình chính dùng để demo là Linear SVM chứ không phải hai mô hình phân loại độc lập.</w:t>
+      </w:r>
+    </w:p>
+    <w:p>
       <w:pPr>
         <w:ind w:left="425"/>
       </w:pPr>
@@ -6181,23 +6185,7 @@
         <w:ind w:left="425"/>
       </w:pPr>
       <w:r>
-        <w:t>- Inference: src/models/predict.py và app.py nạp mô hình đã lưu dưới dạng joblib. Trong bản demo hiện tại, ứng dụng sử dụng svm_</w:t>
-      </w:r>
-      <w:proofErr w:type="gramStart"/>
-      <w:r>
-        <w:t>best.joblib</w:t>
-      </w:r>
-      <w:proofErr w:type="gramEnd"/>
-      <w:r>
-        <w:t xml:space="preserve"> để bám sát hướng TF-IDF + SVM của đề tài, trong khi pipeline huấn luyện vẫn xuất best_</w:t>
-      </w:r>
-      <w:proofErr w:type="gramStart"/>
-      <w:r>
-        <w:t>model.joblib</w:t>
-      </w:r>
-      <w:proofErr w:type="gramEnd"/>
-      <w:r>
-        <w:t xml:space="preserve"> để hỗ trợ triển khai tự động theo mô hình mạnh nhất.</w:t>
+        <w:t>- Inference: src/models/predict.py và app.py nạp mô hình đã lưu dưới dạng joblib. Trong bản demo hiện tại, ứng dụng sử dụng svm_best.joblib, tức pipeline gồm TF-IDF để biểu diễn đặc trưng và Linear SVM để phân loại. Nói cách khác, mô hình chính của app là Linear SVM; còn TF-IDF là lớp trích xuất đặc trưng đi kèm trong pipeline. Trong khi đó, pipeline huấn luyện vẫn xuất best_model.joblib để hỗ trợ triển khai tự động theo mô hình mạnh nhất ở benchmark.</w:t>
       </w:r>
     </w:p>
     <w:p>
@@ -7280,11 +7268,7 @@
         <w:ind w:firstLine="567"/>
       </w:pPr>
       <w:r>
-        <w:t xml:space="preserve">Theo đúng định hướng đề tài 19, hai mô hình chính của nhóm là Multinomial Naive Bayes và Linear SVM. Naive Bayes đóng vai trò mô hình xác suất đơn giản, huấn luyện rất nhanh và thường có recall tốt; đây cũng là hướng tiếp cận phù hợp với các nghiên cứu Bayesian filtering trên môi trường email thực [14]. Linear SVM là mô hình tuyến tính mạnh trên dữ liệu văn bản thưa, phù hợp với không gian TF-IDF kích thước lớn và được nhiều công trình so sánh gần đây xác nhận vẫn cạnh tranh cao khi chi phí triển khai là yếu tố quan trọng [7], [15]. Để đánh giá khách quan hơn, nhóm benchmark thêm Logistic </w:t>
-      </w:r>
-      <w:r>
-        <w:lastRenderedPageBreak/>
-        <w:t>Regression và Random Forest; kết quả này giúp chứng minh lựa chọn mô hình của nhóm không dựa trên cảm tính mà dựa trên thực nghiệm.</w:t>
+        <w:t>Theo đúng định hướng đề tài 19, hai mô hình trọng tâm được nhóm đem ra đối chiếu là Multinomial Naive Bayes và Linear SVM; tuy nhiên mô hình chính dùng trong phần demo và trình bày của hệ thống là Linear SVM. Naive Bayes đóng vai trò mô hình xác suất đơn giản, huấn luyện rất nhanh và thường có recall tốt; đây cũng là hướng tiếp cận phù hợp với các nghiên cứu Bayesian filtering trên môi trường email thực [14]. Linear SVM là mô hình tuyến tính mạnh trên dữ liệu văn bản thưa, phù hợp với không gian TF-IDF kích thước lớn và được nhiều công trình so sánh gần đây xác nhận vẫn cạnh tranh cao khi chi phí triển khai là yếu tố quan trọng [7], [15]. Để đánh giá khách quan hơn, nhóm benchmark thêm Logistic Regression và Random Forest; kết quả này giúp chứng minh lựa chọn mô hình của nhóm không dựa trên cảm tính mà dựa trên thực nghiệm.</w:t>
       </w:r>
     </w:p>
     <w:p>
@@ -8671,7 +8655,7 @@
         <w:ind w:firstLine="567"/>
       </w:pPr>
       <w:r>
-        <w:t>Mặc dù Logistic Regression đứng đầu về benchmark, nhóm vẫn sử dụng Linear SVM làm mô hình demo vì đây là hướng đúng với đề tài đã đăng ký và cũng thuận lợi cho phần giải thích token trên giao diện. Với SVM, báo cáo chi tiết hiện có F1_ham = 98.99%, F1_spam = 97.69%, macro F1 = 98.34%, balanced accuracy = 98.34%, specificity = 98.99% và ROC-AUC = 99.79%. Trên tập test 1139 email, mô hình chỉ chặn nhầm 8 email ham và bỏ sót 8 email spam. Nhìn theo góc độ triển khai, đây là mức đánh đổi rất tốt giữa hiệu năng, tốc độ suy luận và khả năng giải thích [4], [15].</w:t>
+        <w:t>Mặc dù Logistic Regression đứng đầu về benchmark, nhóm vẫn sử dụng Linear SVM làm mô hình demo vì đây là hướng đúng với đề tài đã đăng ký và cũng thuận lợi cho phần giải thích token trên giao diện. Cần nhấn mạnh rằng pipeline demo được viết dưới dạng TF-IDF + Linear SVM, trong đó TF-IDF là lớp biểu diễn đặc trưng còn Linear SVM là bộ phân loại chính. Với SVM, báo cáo chi tiết hiện có F1_ham = 98.99%, F1_spam = 97.69%, macro F1 = 98.34%, balanced accuracy = 98.34%, specificity = 98.99% và ROC-AUC = 99.79%. Trên tập test 1139 email, mô hình chỉ chặn nhầm 8 email ham và bỏ sót 8 email spam. Nhìn theo góc độ triển khai, đây là mức đánh đổi rất tốt giữa hiệu năng, tốc độ suy luận và khả năng giải thích [4], [15].</w:t>
       </w:r>
     </w:p>
     <w:p>

</xml_diff>